<commit_message>
Add files via upload
</commit_message>
<xml_diff>
--- a/template-installment.docx
+++ b/template-installment.docx
@@ -14,7 +14,7 @@
       </w:pPr>
       <w:r>
         <w:rPr>
-          <w:rFonts w:eastAsia="Calibri" w:cs="Times New Roman"/>
+          <w:rFonts w:eastAsia="Calibri" w:cs="Times New Roman" w:ascii="Calibri" w:hAnsi="Calibri"/>
           <w:sz w:val="24"/>
           <w:szCs w:val="24"/>
         </w:rPr>
@@ -204,6 +204,7 @@
       <w:pPr>
         <w:pStyle w:val="Normal"/>
         <w:spacing w:lineRule="auto" w:line="240" w:before="0" w:after="0"/>
+        <w:ind w:firstLine="708"/>
         <w:jc w:val="both"/>
         <w:rPr>
           <w:rFonts w:ascii="Times New Roman" w:hAnsi="Times New Roman" w:eastAsia="Calibri" w:cs="Times New Roman"/>
@@ -464,25 +465,45 @@
           <w:szCs w:val="24"/>
           <w:lang w:val="en-US"/>
         </w:rPr>
-        <w:t>Зарегистрирован:                 {registration_address}</w:t>
-      </w:r>
-    </w:p>
-    <w:p>
-      <w:pPr>
-        <w:pStyle w:val="Normal"/>
-        <w:spacing w:lineRule="auto" w:line="240" w:before="0" w:after="0"/>
-        <w:jc w:val="both"/>
-        <w:rPr>
-          <w:rFonts w:ascii="Times New Roman" w:hAnsi="Times New Roman" w:eastAsia="Calibri" w:cs="Times New Roman"/>
-          <w:sz w:val="24"/>
-          <w:szCs w:val="24"/>
-        </w:rPr>
-      </w:pPr>
-      <w:r>
-        <w:rPr>
-          <w:rFonts w:eastAsia="Calibri" w:cs="Times New Roman" w:ascii="Times New Roman" w:hAnsi="Times New Roman"/>
-          <w:sz w:val="24"/>
-          <w:szCs w:val="24"/>
+        <w:t>Зарегистрирован</w:t>
+      </w:r>
+      <w:r>
+        <w:rPr>
+          <w:rFonts w:ascii="Times New Roman" w:hAnsi="Times New Roman"/>
+          <w:lang w:val="en-US"/>
+        </w:rPr>
+        <w:t>:</w:t>
+      </w:r>
+      <w:r>
+        <w:rPr>
+          <w:lang w:val="en-US"/>
+        </w:rPr>
+        <w:t xml:space="preserve">                     </w:t>
+      </w:r>
+      <w:r>
+        <w:rPr>
+          <w:rFonts w:ascii="Times New Roman" w:hAnsi="Times New Roman"/>
+          <w:sz w:val="24"/>
+          <w:szCs w:val="24"/>
+          <w:lang w:val="en-US"/>
+        </w:rPr>
+        <w:t>{registration_address}</w:t>
+      </w:r>
+    </w:p>
+    <w:p>
+      <w:pPr>
+        <w:pStyle w:val="Normal"/>
+        <w:spacing w:lineRule="auto" w:line="240" w:before="0" w:after="0"/>
+        <w:jc w:val="both"/>
+        <w:rPr>
+          <w:rFonts w:ascii="Times New Roman" w:hAnsi="Times New Roman"/>
+          <w:sz w:val="24"/>
+          <w:szCs w:val="24"/>
+        </w:rPr>
+      </w:pPr>
+      <w:r>
+        <w:rPr>
+          <w:lang w:val="en-US"/>
         </w:rPr>
       </w:r>
     </w:p>
@@ -709,26 +730,22 @@
     <w:p>
       <w:pPr>
         <w:pStyle w:val="Normal"/>
-        <w:numPr>
-          <w:ilvl w:val="0"/>
-          <w:numId w:val="0"/>
-        </w:numPr>
-        <w:spacing w:lineRule="auto" w:line="240" w:before="0" w:after="0"/>
-        <w:ind w:hanging="0" w:start="0"/>
-        <w:contextualSpacing/>
-        <w:jc w:val="both"/>
-        <w:rPr>
-          <w:rFonts w:ascii="Times New Roman" w:hAnsi="Times New Roman" w:eastAsia="Calibri" w:cs="Times New Roman"/>
-          <w:sz w:val="24"/>
-          <w:szCs w:val="24"/>
-        </w:rPr>
-      </w:pPr>
-      <w:r>
-        <w:rPr>
-          <w:rFonts w:eastAsia="Calibri" w:cs="Times New Roman" w:ascii="Times New Roman" w:hAnsi="Times New Roman"/>
-          <w:sz w:val="24"/>
-          <w:szCs w:val="24"/>
-        </w:rPr>
+        <w:spacing w:lineRule="auto" w:line="240" w:before="0" w:after="0"/>
+        <w:contextualSpacing/>
+        <w:jc w:val="both"/>
+        <w:rPr>
+          <w:rFonts w:ascii="Times New Roman" w:hAnsi="Times New Roman" w:eastAsia="Calibri" w:cs="Times New Roman"/>
+          <w:sz w:val="24"/>
+          <w:szCs w:val="24"/>
+        </w:rPr>
+      </w:pPr>
+      <w:r>
+        <w:rPr>
+          <w:rFonts w:eastAsia="Calibri" w:cs="Times New Roman" w:ascii="Times New Roman" w:hAnsi="Times New Roman"/>
+          <w:sz w:val="24"/>
+          <w:szCs w:val="24"/>
+        </w:rPr>
+        <w:tab/>
       </w:r>
     </w:p>
     <w:p>
@@ -937,12 +954,15 @@
         </w:rPr>
       </w:pPr>
       <w:r>
+        <w:rPr/>
+        <w:tab/>
+      </w:r>
+      <w:r>
         <w:rPr>
           <w:rFonts w:ascii="Times New Roman" w:hAnsi="Times New Roman"/>
           <w:sz w:val="24"/>
           <w:szCs w:val="24"/>
         </w:rPr>
-        <w:tab/>
         <w:t>Общая проектная площадь, кв.м. {area}</w:t>
       </w:r>
     </w:p>
@@ -959,11 +979,7 @@
         </w:rPr>
       </w:pPr>
       <w:r>
-        <w:rPr>
-          <w:rFonts w:ascii="Times New Roman" w:hAnsi="Times New Roman"/>
-          <w:sz w:val="24"/>
-          <w:szCs w:val="24"/>
-        </w:rPr>
+        <w:rPr/>
       </w:r>
     </w:p>
     <w:p>
@@ -989,7 +1005,7 @@
           <w:sz w:val="24"/>
           <w:szCs w:val="24"/>
         </w:rPr>
-        <w:t xml:space="preserve">Строительство Многоквартирного жилого дома осуществляется на земельном участке с кадастровым номером 05:49:000039:2973 общей площадью 10 000 кв.м., правами на использование которого для строительства Застройщик обладает на основании договора купли-продажи земельного участка от 23 августа 2022 года. </w:t>
+        <w:t xml:space="preserve">Строительство Многоквартирного жилого дома осуществляется на земельном участке с кадастровым номером 05:49:000039:2973 общей площадью 10 000 кв.м., принадлежащем на праве собственности Гамзатову Магомедарипу Магомедгаджиеву правами на использование которого для строительства Застройщик обладает на основании договора подряда от 15.09.2025. </w:t>
       </w:r>
       <w:r>
         <w:rPr>
@@ -1552,7 +1568,7 @@
           <w:sz w:val="24"/>
           <w:szCs w:val="24"/>
         </w:rPr>
-        <w:t>Застройщик направляет участнику долевого строительства письменное сообщение о завершении строительства и о готовности Помещения к передаче.</w:t>
+        <w:t>Застройщик направляет Инвестору письменное сообщение о завершении строительства и о готовности Помещения к передаче.</w:t>
       </w:r>
     </w:p>
     <w:p>
@@ -2010,7 +2026,7 @@
           <w:sz w:val="24"/>
           <w:szCs w:val="24"/>
         </w:rPr>
-        <w:t>4.1.7. После получения разрешения на ввод в эксплуатацию Многоквартирного жилого дома письменно уведомить Участника долевого строительства о готовности передачи Помещения и необходимости подписания акта приема-передачи.</w:t>
+        <w:t>4.1.7. После получения разрешения на ввод в эксплуатацию Многоквартирного жилого дома письменно уведомить Инвестора о готовности передачи Помещения и необходимости подписания акта приема-передачи.</w:t>
       </w:r>
     </w:p>
     <w:p>
@@ -2967,6 +2983,34 @@
         </w:rPr>
         <w:t>Условия настоящего договора могут быть изменены по взаимному соглашению Сторон. Все изменения, дополнения и соглашения к настоящему договору являются неотъемлемой частью настоящего договора, если совершены в письменной форме и подписаны Сторонами.</w:t>
       </w:r>
+    </w:p>
+    <w:p>
+      <w:pPr>
+        <w:pStyle w:val="ListParagraph"/>
+        <w:numPr>
+          <w:ilvl w:val="1"/>
+          <w:numId w:val="1"/>
+        </w:numPr>
+        <w:spacing w:lineRule="auto" w:line="240" w:before="0" w:after="0"/>
+        <w:ind w:hanging="0" w:start="0"/>
+        <w:contextualSpacing/>
+        <w:jc w:val="both"/>
+        <w:rPr>
+          <w:rFonts w:ascii="Times New Roman" w:hAnsi="Times New Roman" w:eastAsia="Calibri" w:cs="Times New Roman"/>
+          <w:sz w:val="24"/>
+          <w:szCs w:val="24"/>
+        </w:rPr>
+      </w:pPr>
+      <w:bookmarkStart w:id="1" w:name="_GoBack"/>
+      <w:r>
+        <w:rPr>
+          <w:rFonts w:eastAsia="Calibri" w:cs="Times New Roman" w:ascii="Times New Roman" w:hAnsi="Times New Roman"/>
+          <w:sz w:val="24"/>
+          <w:szCs w:val="24"/>
+        </w:rPr>
+        <w:t xml:space="preserve">В случае расторжения договора в соответствии с п. 5.9. Договора по инициативе Инвестора, Инвестор вправе подать письменное заявление о возврате сумм, фактически выплаченных Инвестором на дату подачи письменного заявления о возврате. Застройщик обязуется произвести возврат указанной в п. 6.3. суммы в течении 120 (ста двадцати) календарных дней с даты получения надлежащим образом оформленного заявления о возврате. </w:t>
+      </w:r>
+      <w:bookmarkEnd w:id="1"/>
     </w:p>
     <w:p>
       <w:pPr>
@@ -3195,7 +3239,6 @@
           <w:p>
             <w:pPr>
               <w:pStyle w:val="TableParagraph"/>
-              <w:suppressAutoHyphens w:val="true"/>
               <w:spacing w:before="0" w:after="0"/>
               <w:jc w:val="start"/>
               <w:rPr>
@@ -3218,7 +3261,6 @@
           <w:p>
             <w:pPr>
               <w:pStyle w:val="TableParagraph"/>
-              <w:suppressAutoHyphens w:val="true"/>
               <w:spacing w:before="0" w:after="0"/>
               <w:jc w:val="start"/>
               <w:rPr>
@@ -3272,7 +3314,6 @@
           <w:p>
             <w:pPr>
               <w:pStyle w:val="TableParagraph"/>
-              <w:suppressAutoHyphens w:val="true"/>
               <w:spacing w:before="0" w:after="0"/>
               <w:ind w:start="0"/>
               <w:jc w:val="start"/>
@@ -3284,14 +3325,16 @@
             <w:r>
               <w:rPr>
                 <w:b/>
-                <w:sz w:val="24"/>
+                <w:kern w:val="0"/>
+                <w:sz w:val="24"/>
+                <w:szCs w:val="22"/>
+                <w:lang w:val="ru-RU" w:eastAsia="en-US" w:bidi="ar-SA"/>
               </w:rPr>
             </w:r>
           </w:p>
           <w:p>
             <w:pPr>
               <w:pStyle w:val="TableParagraph"/>
-              <w:suppressAutoHyphens w:val="true"/>
               <w:spacing w:before="0" w:after="0"/>
               <w:jc w:val="start"/>
               <w:rPr>
@@ -3331,7 +3374,6 @@
           <w:p>
             <w:pPr>
               <w:pStyle w:val="TableParagraph"/>
-              <w:suppressAutoHyphens w:val="true"/>
               <w:spacing w:before="0" w:after="0"/>
               <w:jc w:val="start"/>
               <w:rPr>
@@ -3361,7 +3403,6 @@
           <w:p>
             <w:pPr>
               <w:pStyle w:val="TableParagraph"/>
-              <w:suppressAutoHyphens w:val="true"/>
               <w:spacing w:before="0" w:after="0"/>
               <w:jc w:val="start"/>
               <w:rPr>
@@ -3402,7 +3443,6 @@
             <w:pPr>
               <w:pStyle w:val="Normal"/>
               <w:widowControl/>
-              <w:suppressAutoHyphens w:val="true"/>
               <w:spacing w:lineRule="auto" w:line="240" w:before="0" w:after="0"/>
               <w:ind w:start="57"/>
               <w:jc w:val="start"/>
@@ -3435,7 +3475,6 @@
           <w:p>
             <w:pPr>
               <w:pStyle w:val="TableParagraph"/>
-              <w:suppressAutoHyphens w:val="true"/>
               <w:spacing w:before="0" w:after="0"/>
               <w:jc w:val="start"/>
               <w:rPr>
@@ -3465,7 +3504,6 @@
           <w:p>
             <w:pPr>
               <w:pStyle w:val="TableParagraph"/>
-              <w:suppressAutoHyphens w:val="true"/>
               <w:spacing w:before="0" w:after="0"/>
               <w:jc w:val="start"/>
               <w:rPr>
@@ -3486,7 +3524,6 @@
           <w:p>
             <w:pPr>
               <w:pStyle w:val="TableParagraph"/>
-              <w:suppressAutoHyphens w:val="true"/>
               <w:spacing w:before="0" w:after="0"/>
               <w:ind w:start="0"/>
               <w:jc w:val="start"/>
@@ -3498,14 +3535,16 @@
             <w:r>
               <w:rPr>
                 <w:b/>
-                <w:sz w:val="24"/>
+                <w:kern w:val="0"/>
+                <w:sz w:val="24"/>
+                <w:szCs w:val="22"/>
+                <w:lang w:val="ru-RU" w:eastAsia="en-US" w:bidi="ar-SA"/>
               </w:rPr>
             </w:r>
           </w:p>
           <w:p>
             <w:pPr>
               <w:pStyle w:val="TableParagraph"/>
-              <w:suppressAutoHyphens w:val="true"/>
               <w:spacing w:before="0" w:after="0"/>
               <w:jc w:val="both"/>
               <w:rPr>
@@ -3540,13 +3579,33 @@
                 <w:lang w:val="ru-RU" w:eastAsia="en-US" w:bidi="ar-SA"/>
               </w:rPr>
               <w:t xml:space="preserve">директор: </w:t>
+            </w:r>
+          </w:p>
+          <w:p>
+            <w:pPr>
+              <w:pStyle w:val="TableParagraph"/>
+              <w:spacing w:before="25" w:after="0"/>
+              <w:ind w:start="0"/>
+              <w:jc w:val="start"/>
+              <w:rPr>
+                <w:b/>
+                <w:sz w:val="24"/>
+              </w:rPr>
+            </w:pPr>
+            <w:r>
+              <w:rPr>
+                <w:b/>
+                <w:kern w:val="0"/>
+                <w:sz w:val="24"/>
+                <w:szCs w:val="22"/>
+                <w:lang w:val="ru-RU" w:eastAsia="en-US" w:bidi="ar-SA"/>
+              </w:rPr>
             </w:r>
           </w:p>
           <w:p>
             <w:pPr>
               <w:pStyle w:val="Normal"/>
               <w:widowControl/>
-              <w:suppressAutoHyphens w:val="true"/>
               <w:spacing w:lineRule="auto" w:line="240" w:before="0" w:after="0"/>
               <w:contextualSpacing/>
               <w:jc w:val="both"/>
@@ -3566,7 +3625,7 @@
                 <w:szCs w:val="22"/>
                 <w:lang w:val="ru-RU" w:eastAsia="en-US" w:bidi="ar-SA"/>
               </w:rPr>
-              <w:t xml:space="preserve">  </w:t>
+              <w:t xml:space="preserve"> </w:t>
             </w:r>
             <w:r>
               <w:rPr>
@@ -3768,10 +3827,8 @@
             <w:r>
               <w:rPr>
                 <w:rFonts w:eastAsia="Calibri" w:cs="Times New Roman" w:ascii="Times New Roman" w:hAnsi="Times New Roman"/>
-                <w:kern w:val="0"/>
                 <w:sz w:val="24"/>
                 <w:szCs w:val="24"/>
-                <w:lang w:val="ru-RU" w:eastAsia="en-US" w:bidi="ar-SA"/>
               </w:rPr>
             </w:r>
           </w:p>
@@ -3841,7 +3898,7 @@
             <w:r>
               <w:rPr>
                 <w:kern w:val="0"/>
-                <w:lang w:val="en-US" w:eastAsia="en-US" w:bidi="ar-SA"/>
+                <w:lang w:eastAsia="en-US" w:bidi="ar-SA"/>
               </w:rPr>
             </w:r>
           </w:p>
@@ -3892,27 +3949,7 @@
                 <w:szCs w:val="24"/>
                 <w:lang w:eastAsia="en-US" w:bidi="ar-SA"/>
               </w:rPr>
-              <w:t>{</w:t>
-            </w:r>
-            <w:r>
-              <w:rPr>
-                <w:rFonts w:eastAsia="Calibri" w:cs="Times New Roman" w:ascii="Times New Roman" w:hAnsi="Times New Roman"/>
-                <w:kern w:val="0"/>
-                <w:sz w:val="24"/>
-                <w:szCs w:val="24"/>
-                <w:lang w:eastAsia="en-US" w:bidi="ar-SA"/>
-              </w:rPr>
-              <w:t>living</w:t>
-            </w:r>
-            <w:r>
-              <w:rPr>
-                <w:rFonts w:eastAsia="Calibri" w:cs="Times New Roman" w:ascii="Times New Roman" w:hAnsi="Times New Roman"/>
-                <w:kern w:val="0"/>
-                <w:sz w:val="24"/>
-                <w:szCs w:val="24"/>
-                <w:lang w:eastAsia="en-US" w:bidi="ar-SA"/>
-              </w:rPr>
-              <w:t>_address}</w:t>
+              <w:t>{living_address}</w:t>
             </w:r>
           </w:p>
           <w:p>
@@ -3931,10 +3968,7 @@
             </w:pPr>
             <w:r>
               <w:rPr>
-                <w:rFonts w:eastAsia="Calibri" w:cs="Times New Roman" w:ascii="Times New Roman" w:hAnsi="Times New Roman"/>
                 <w:kern w:val="0"/>
-                <w:sz w:val="24"/>
-                <w:szCs w:val="24"/>
                 <w:lang w:eastAsia="en-US" w:bidi="ar-SA"/>
               </w:rPr>
             </w:r>
@@ -3981,10 +4015,8 @@
             <w:r>
               <w:rPr>
                 <w:rFonts w:eastAsia="Calibri" w:cs="Times New Roman" w:ascii="Times New Roman" w:hAnsi="Times New Roman"/>
-                <w:kern w:val="0"/>
                 <w:sz w:val="24"/>
                 <w:szCs w:val="24"/>
-                <w:lang w:val="ru-RU" w:eastAsia="en-US" w:bidi="ar-SA"/>
               </w:rPr>
             </w:r>
           </w:p>
@@ -4080,10 +4112,8 @@
                 <w:b w:val="false"/>
                 <w:bCs w:val="false"/>
                 <w:color w:val="auto"/>
-                <w:kern w:val="0"/>
                 <w:sz w:val="24"/>
                 <w:szCs w:val="24"/>
-                <w:lang w:val="ru-RU" w:eastAsia="en-US" w:bidi="ar-SA"/>
               </w:rPr>
               <w:t>{shortname}</w:t>
             </w:r>
@@ -4093,20 +4123,18 @@
                 <w:b/>
                 <w:bCs/>
                 <w:color w:val="auto"/>
-                <w:kern w:val="0"/>
                 <w:sz w:val="24"/>
                 <w:szCs w:val="24"/>
-                <w:lang w:val="ru-RU" w:eastAsia="en-US" w:bidi="ar-SA"/>
               </w:rPr>
               <w:t xml:space="preserve"> </w:t>
             </w:r>
             <w:r>
               <w:rPr>
-                <w:rFonts w:eastAsia="Calibri" w:cs="Times New Roman" w:ascii="Times New Roman" w:hAnsi="Times New Roman"/>
-                <w:kern w:val="0"/>
+                <w:rFonts w:cs="Times New Roman" w:ascii="Times New Roman" w:hAnsi="Times New Roman"/>
+                <w:b/>
+                <w:bCs/>
                 <w:sz w:val="24"/>
                 <w:szCs w:val="24"/>
-                <w:lang w:val="ru-RU" w:eastAsia="en-US" w:bidi="ar-SA"/>
               </w:rPr>
               <w:t>__________________</w:t>
             </w:r>
@@ -4115,7 +4143,6 @@
             <w:pPr>
               <w:pStyle w:val="Normal"/>
               <w:widowControl/>
-              <w:suppressAutoHyphens w:val="true"/>
               <w:spacing w:lineRule="auto" w:line="240" w:before="0" w:after="0"/>
               <w:contextualSpacing/>
               <w:jc w:val="both"/>
@@ -4132,8 +4159,10 @@
                 <w:rFonts w:eastAsia="Calibri" w:cs="Times New Roman" w:ascii="Times New Roman" w:hAnsi="Times New Roman"/>
                 <w:b/>
                 <w:bCs/>
+                <w:kern w:val="0"/>
                 <w:sz w:val="24"/>
                 <w:szCs w:val="24"/>
+                <w:lang w:val="ru-RU" w:eastAsia="en-US" w:bidi="ar-SA"/>
               </w:rPr>
             </w:r>
           </w:p>
@@ -4351,6 +4380,7 @@
           <w:sz w:val="24"/>
           <w:szCs w:val="24"/>
         </w:rPr>
+        <w:t>Приложение № 1</w:t>
       </w:r>
     </w:p>
     <w:p>
@@ -4375,13 +4405,13 @@
           <w:sz w:val="24"/>
           <w:szCs w:val="24"/>
         </w:rPr>
-      </w:r>
-    </w:p>
-    <w:p>
-      <w:pPr>
-        <w:pStyle w:val="Normal"/>
-        <w:spacing w:lineRule="auto" w:line="240" w:before="0" w:after="0"/>
-        <w:ind w:start="5954"/>
+        <w:t>к договору инвестирования в строительство многоквартирного жилого дома от {current_date}</w:t>
+      </w:r>
+    </w:p>
+    <w:p>
+      <w:pPr>
+        <w:pStyle w:val="Normal"/>
+        <w:spacing w:lineRule="auto" w:line="240" w:before="0" w:after="0"/>
         <w:contextualSpacing/>
         <w:jc w:val="both"/>
         <w:rPr>
@@ -4405,7 +4435,6 @@
       <w:pPr>
         <w:pStyle w:val="Normal"/>
         <w:spacing w:lineRule="auto" w:line="240" w:before="0" w:after="0"/>
-        <w:ind w:start="5954"/>
         <w:contextualSpacing/>
         <w:jc w:val="both"/>
         <w:rPr>
@@ -4429,222 +4458,6 @@
       <w:pPr>
         <w:pStyle w:val="Normal"/>
         <w:spacing w:lineRule="auto" w:line="240" w:before="0" w:after="0"/>
-        <w:ind w:start="5954"/>
-        <w:contextualSpacing/>
-        <w:jc w:val="both"/>
-        <w:rPr>
-          <w:rFonts w:ascii="Times New Roman" w:hAnsi="Times New Roman" w:eastAsia="Calibri" w:cs="Times New Roman"/>
-          <w:i/>
-          <w:i/>
-          <w:sz w:val="24"/>
-          <w:szCs w:val="24"/>
-        </w:rPr>
-      </w:pPr>
-      <w:r>
-        <w:rPr>
-          <w:rFonts w:eastAsia="Calibri" w:cs="Times New Roman" w:ascii="Times New Roman" w:hAnsi="Times New Roman"/>
-          <w:i/>
-          <w:sz w:val="24"/>
-          <w:szCs w:val="24"/>
-        </w:rPr>
-      </w:r>
-    </w:p>
-    <w:p>
-      <w:pPr>
-        <w:pStyle w:val="Normal"/>
-        <w:spacing w:lineRule="auto" w:line="240" w:before="0" w:after="0"/>
-        <w:ind w:start="5954"/>
-        <w:contextualSpacing/>
-        <w:jc w:val="both"/>
-        <w:rPr>
-          <w:rFonts w:ascii="Times New Roman" w:hAnsi="Times New Roman" w:eastAsia="Calibri" w:cs="Times New Roman"/>
-          <w:i/>
-          <w:i/>
-          <w:sz w:val="24"/>
-          <w:szCs w:val="24"/>
-        </w:rPr>
-      </w:pPr>
-      <w:r>
-        <w:rPr>
-          <w:rFonts w:eastAsia="Calibri" w:cs="Times New Roman" w:ascii="Times New Roman" w:hAnsi="Times New Roman"/>
-          <w:i/>
-          <w:sz w:val="24"/>
-          <w:szCs w:val="24"/>
-        </w:rPr>
-      </w:r>
-    </w:p>
-    <w:p>
-      <w:pPr>
-        <w:pStyle w:val="Normal"/>
-        <w:spacing w:lineRule="auto" w:line="240" w:before="0" w:after="0"/>
-        <w:ind w:start="5954"/>
-        <w:contextualSpacing/>
-        <w:jc w:val="both"/>
-        <w:rPr>
-          <w:rFonts w:ascii="Times New Roman" w:hAnsi="Times New Roman" w:eastAsia="Calibri" w:cs="Times New Roman"/>
-          <w:i/>
-          <w:i/>
-          <w:sz w:val="24"/>
-          <w:szCs w:val="24"/>
-        </w:rPr>
-      </w:pPr>
-      <w:r>
-        <w:rPr>
-          <w:rFonts w:eastAsia="Calibri" w:cs="Times New Roman" w:ascii="Times New Roman" w:hAnsi="Times New Roman"/>
-          <w:i/>
-          <w:sz w:val="24"/>
-          <w:szCs w:val="24"/>
-        </w:rPr>
-      </w:r>
-    </w:p>
-    <w:p>
-      <w:pPr>
-        <w:pStyle w:val="Normal"/>
-        <w:spacing w:lineRule="auto" w:line="240" w:before="0" w:after="0"/>
-        <w:ind w:start="5954"/>
-        <w:contextualSpacing/>
-        <w:jc w:val="both"/>
-        <w:rPr>
-          <w:rFonts w:ascii="Times New Roman" w:hAnsi="Times New Roman" w:eastAsia="Calibri" w:cs="Times New Roman"/>
-          <w:i/>
-          <w:i/>
-          <w:sz w:val="24"/>
-          <w:szCs w:val="24"/>
-        </w:rPr>
-      </w:pPr>
-      <w:r>
-        <w:rPr>
-          <w:rFonts w:eastAsia="Calibri" w:cs="Times New Roman" w:ascii="Times New Roman" w:hAnsi="Times New Roman"/>
-          <w:i/>
-          <w:sz w:val="24"/>
-          <w:szCs w:val="24"/>
-        </w:rPr>
-      </w:r>
-    </w:p>
-    <w:p>
-      <w:pPr>
-        <w:pStyle w:val="Normal"/>
-        <w:spacing w:lineRule="auto" w:line="240" w:before="0" w:after="0"/>
-        <w:ind w:start="5954"/>
-        <w:contextualSpacing/>
-        <w:jc w:val="both"/>
-        <w:rPr>
-          <w:rFonts w:ascii="Times New Roman" w:hAnsi="Times New Roman" w:eastAsia="Calibri" w:cs="Times New Roman"/>
-          <w:i/>
-          <w:i/>
-          <w:sz w:val="24"/>
-          <w:szCs w:val="24"/>
-        </w:rPr>
-      </w:pPr>
-      <w:r>
-        <w:rPr>
-          <w:rFonts w:eastAsia="Calibri" w:cs="Times New Roman" w:ascii="Times New Roman" w:hAnsi="Times New Roman"/>
-          <w:i/>
-          <w:sz w:val="24"/>
-          <w:szCs w:val="24"/>
-        </w:rPr>
-      </w:r>
-    </w:p>
-    <w:p>
-      <w:pPr>
-        <w:pStyle w:val="Normal"/>
-        <w:spacing w:lineRule="auto" w:line="240" w:before="0" w:after="0"/>
-        <w:ind w:start="5954"/>
-        <w:contextualSpacing/>
-        <w:jc w:val="both"/>
-        <w:rPr>
-          <w:rFonts w:ascii="Times New Roman" w:hAnsi="Times New Roman" w:eastAsia="Calibri" w:cs="Times New Roman"/>
-          <w:i/>
-          <w:i/>
-          <w:sz w:val="24"/>
-          <w:szCs w:val="24"/>
-        </w:rPr>
-      </w:pPr>
-      <w:r>
-        <w:rPr>
-          <w:rFonts w:eastAsia="Calibri" w:cs="Times New Roman" w:ascii="Times New Roman" w:hAnsi="Times New Roman"/>
-          <w:i/>
-          <w:sz w:val="24"/>
-          <w:szCs w:val="24"/>
-        </w:rPr>
-        <w:t>Приложение № 1</w:t>
-      </w:r>
-    </w:p>
-    <w:p>
-      <w:pPr>
-        <w:pStyle w:val="Normal"/>
-        <w:spacing w:lineRule="auto" w:line="240" w:before="0" w:after="0"/>
-        <w:ind w:start="5954"/>
-        <w:contextualSpacing/>
-        <w:jc w:val="both"/>
-        <w:rPr>
-          <w:rFonts w:ascii="Times New Roman" w:hAnsi="Times New Roman" w:eastAsia="Calibri" w:cs="Times New Roman"/>
-          <w:i/>
-          <w:i/>
-          <w:sz w:val="24"/>
-          <w:szCs w:val="24"/>
-        </w:rPr>
-      </w:pPr>
-      <w:r>
-        <w:rPr>
-          <w:rFonts w:eastAsia="Calibri" w:cs="Times New Roman" w:ascii="Times New Roman" w:hAnsi="Times New Roman"/>
-          <w:i/>
-          <w:sz w:val="24"/>
-          <w:szCs w:val="24"/>
-        </w:rPr>
-        <w:t>к договору инвестирования в строительство многоквартирного жилого дома от {current_date}</w:t>
-      </w:r>
-    </w:p>
-    <w:p>
-      <w:pPr>
-        <w:pStyle w:val="Normal"/>
-        <w:spacing w:lineRule="auto" w:line="240" w:before="0" w:after="0"/>
-        <w:contextualSpacing/>
-        <w:jc w:val="both"/>
-        <w:rPr>
-          <w:rFonts w:ascii="Times New Roman" w:hAnsi="Times New Roman" w:eastAsia="Calibri" w:cs="Times New Roman"/>
-          <w:i/>
-          <w:i/>
-          <w:sz w:val="24"/>
-          <w:szCs w:val="24"/>
-        </w:rPr>
-      </w:pPr>
-      <w:r>
-        <w:rPr>
-          <w:rFonts w:eastAsia="Calibri" w:cs="Times New Roman" w:ascii="Times New Roman" w:hAnsi="Times New Roman"/>
-          <w:i/>
-          <w:sz w:val="24"/>
-          <w:szCs w:val="24"/>
-        </w:rPr>
-      </w:r>
-    </w:p>
-    <w:p>
-      <w:pPr>
-        <w:pStyle w:val="Normal"/>
-        <w:spacing w:lineRule="auto" w:line="240" w:before="0" w:after="0"/>
-        <w:contextualSpacing/>
-        <w:jc w:val="both"/>
-        <w:rPr>
-          <w:rFonts w:ascii="Times New Roman" w:hAnsi="Times New Roman" w:eastAsia="Calibri" w:cs="Times New Roman"/>
-          <w:i/>
-          <w:i/>
-          <w:sz w:val="24"/>
-          <w:szCs w:val="24"/>
-        </w:rPr>
-      </w:pPr>
-      <w:r>
-        <w:rPr>
-          <w:rFonts w:eastAsia="Calibri" w:cs="Times New Roman" w:ascii="Times New Roman" w:hAnsi="Times New Roman"/>
-          <w:i/>
-          <w:sz w:val="24"/>
-          <w:szCs w:val="24"/>
-        </w:rPr>
-      </w:r>
-    </w:p>
-    <w:p>
-      <w:pPr>
-        <w:pStyle w:val="Normal"/>
-        <w:spacing w:lineRule="auto" w:line="240" w:before="0" w:after="0"/>
         <w:contextualSpacing/>
         <w:jc w:val="center"/>
         <w:rPr>
@@ -4727,7 +4540,7 @@
         </w:rPr>
         <w:t xml:space="preserve">Инвестор уведомлен, что в случае просрочки внесения очередного платежа более 2 (двух) месяцев </w:t>
       </w:r>
-      <w:bookmarkStart w:id="1" w:name="_Hlk185016097"/>
+      <w:bookmarkStart w:id="2" w:name="_Hlk185016097"/>
       <w:r>
         <w:rPr>
           <w:rFonts w:eastAsia="Calibri" w:cs="Times New Roman" w:ascii="Times New Roman" w:hAnsi="Times New Roman"/>
@@ -4736,7 +4549,7 @@
         </w:rPr>
         <w:t>Застройщик вправе расторгнуть договор в одностороннем порядке. В этом случае, Инвестору возвращается сумма, внесенных им ранее платежей, а Застройщик освобождается от обязанности передать Помещение в соответствии с п. 4.1.5.</w:t>
       </w:r>
-      <w:bookmarkEnd w:id="1"/>
+      <w:bookmarkEnd w:id="2"/>
     </w:p>
     <w:tbl>
       <w:tblPr>
@@ -4756,8 +4569,8 @@
       <w:tblGrid>
         <w:gridCol w:w="794"/>
         <w:gridCol w:w="2698"/>
-        <w:gridCol w:w="2831"/>
-        <w:gridCol w:w="3110"/>
+        <w:gridCol w:w="2830"/>
+        <w:gridCol w:w="3111"/>
       </w:tblGrid>
       <w:tr>
         <w:trPr>
@@ -4835,7 +4648,7 @@
         </w:tc>
         <w:tc>
           <w:tcPr>
-            <w:tcW w:w="2831" w:type="dxa"/>
+            <w:tcW w:w="2830" w:type="dxa"/>
             <w:tcBorders/>
           </w:tcPr>
           <w:p>
@@ -4865,7 +4678,7 @@
         </w:tc>
         <w:tc>
           <w:tcPr>
-            <w:tcW w:w="3110" w:type="dxa"/>
+            <w:tcW w:w="3111" w:type="dxa"/>
             <w:tcBorders/>
           </w:tcPr>
           <w:p>
@@ -4933,8 +4746,8 @@
       <w:tblGrid>
         <w:gridCol w:w="794"/>
         <w:gridCol w:w="2698"/>
-        <w:gridCol w:w="2831"/>
-        <w:gridCol w:w="3110"/>
+        <w:gridCol w:w="2830"/>
+        <w:gridCol w:w="3111"/>
       </w:tblGrid>
       <w:tr>
         <w:trPr>
@@ -4999,7 +4812,7 @@
         </w:tc>
         <w:tc>
           <w:tcPr>
-            <w:tcW w:w="2831" w:type="dxa"/>
+            <w:tcW w:w="2830" w:type="dxa"/>
             <w:tcBorders/>
           </w:tcPr>
           <w:p>
@@ -5026,7 +4839,7 @@
         </w:tc>
         <w:tc>
           <w:tcPr>
-            <w:tcW w:w="3110" w:type="dxa"/>
+            <w:tcW w:w="3111" w:type="dxa"/>
             <w:tcBorders/>
           </w:tcPr>
           <w:p>
@@ -5091,8 +4904,8 @@
       <w:tblGrid>
         <w:gridCol w:w="794"/>
         <w:gridCol w:w="4113"/>
-        <w:gridCol w:w="1416"/>
-        <w:gridCol w:w="3110"/>
+        <w:gridCol w:w="1415"/>
+        <w:gridCol w:w="3111"/>
       </w:tblGrid>
       <w:tr>
         <w:trPr>
@@ -5127,7 +4940,7 @@
         </w:tc>
         <w:tc>
           <w:tcPr>
-            <w:tcW w:w="5529" w:type="dxa"/>
+            <w:tcW w:w="5528" w:type="dxa"/>
             <w:gridSpan w:val="2"/>
             <w:tcBorders/>
           </w:tcPr>
@@ -5158,7 +4971,7 @@
         </w:tc>
         <w:tc>
           <w:tcPr>
-            <w:tcW w:w="3110" w:type="dxa"/>
+            <w:tcW w:w="3111" w:type="dxa"/>
             <w:tcBorders/>
           </w:tcPr>
           <w:p>
@@ -5268,6 +5081,104 @@
           <w:rFonts w:eastAsia="Calibri" w:cs="Times New Roman" w:ascii="Times New Roman" w:hAnsi="Times New Roman"/>
           <w:b/>
           <w:bCs/>
+          <w:sz w:val="24"/>
+          <w:szCs w:val="24"/>
+        </w:rPr>
+      </w:r>
+    </w:p>
+    <w:p>
+      <w:pPr>
+        <w:pStyle w:val="Normal"/>
+        <w:spacing w:lineRule="auto" w:line="240" w:before="0" w:after="0"/>
+        <w:contextualSpacing/>
+        <w:jc w:val="both"/>
+        <w:rPr>
+          <w:rFonts w:ascii="Times New Roman" w:hAnsi="Times New Roman" w:eastAsia="Calibri" w:cs="Times New Roman"/>
+          <w:sz w:val="24"/>
+          <w:szCs w:val="24"/>
+        </w:rPr>
+      </w:pPr>
+      <w:r>
+        <w:rPr>
+          <w:rFonts w:eastAsia="Calibri" w:cs="Times New Roman" w:ascii="Times New Roman" w:hAnsi="Times New Roman"/>
+          <w:sz w:val="24"/>
+          <w:szCs w:val="24"/>
+        </w:rPr>
+      </w:r>
+    </w:p>
+    <w:p>
+      <w:pPr>
+        <w:pStyle w:val="Normal"/>
+        <w:spacing w:lineRule="auto" w:line="240" w:before="0" w:after="0"/>
+        <w:contextualSpacing/>
+        <w:jc w:val="both"/>
+        <w:rPr>
+          <w:rFonts w:ascii="Calibri" w:hAnsi="Calibri" w:eastAsia="Calibri" w:cs="Times New Roman"/>
+          <w:sz w:val="24"/>
+          <w:szCs w:val="24"/>
+        </w:rPr>
+      </w:pPr>
+      <w:r>
+        <w:rPr>
+          <w:rFonts w:eastAsia="Calibri" w:cs="Times New Roman" w:ascii="Calibri" w:hAnsi="Calibri"/>
+          <w:sz w:val="24"/>
+          <w:szCs w:val="24"/>
+        </w:rPr>
+      </w:r>
+    </w:p>
+    <w:p>
+      <w:pPr>
+        <w:pStyle w:val="Normal"/>
+        <w:spacing w:lineRule="auto" w:line="240" w:before="0" w:after="0"/>
+        <w:contextualSpacing/>
+        <w:jc w:val="both"/>
+        <w:rPr>
+          <w:rFonts w:ascii="Calibri" w:hAnsi="Calibri" w:eastAsia="Calibri" w:cs="Times New Roman"/>
+          <w:sz w:val="24"/>
+          <w:szCs w:val="24"/>
+        </w:rPr>
+      </w:pPr>
+      <w:r>
+        <w:rPr>
+          <w:rFonts w:eastAsia="Calibri" w:cs="Times New Roman" w:ascii="Calibri" w:hAnsi="Calibri"/>
+          <w:sz w:val="24"/>
+          <w:szCs w:val="24"/>
+        </w:rPr>
+      </w:r>
+    </w:p>
+    <w:p>
+      <w:pPr>
+        <w:pStyle w:val="Normal"/>
+        <w:spacing w:lineRule="auto" w:line="240" w:before="0" w:after="0"/>
+        <w:contextualSpacing/>
+        <w:jc w:val="both"/>
+        <w:rPr>
+          <w:rFonts w:ascii="Calibri" w:hAnsi="Calibri" w:eastAsia="Calibri" w:cs="Times New Roman"/>
+          <w:sz w:val="24"/>
+          <w:szCs w:val="24"/>
+        </w:rPr>
+      </w:pPr>
+      <w:r>
+        <w:rPr>
+          <w:rFonts w:eastAsia="Calibri" w:cs="Times New Roman" w:ascii="Calibri" w:hAnsi="Calibri"/>
+          <w:sz w:val="24"/>
+          <w:szCs w:val="24"/>
+        </w:rPr>
+      </w:r>
+    </w:p>
+    <w:p>
+      <w:pPr>
+        <w:pStyle w:val="Normal"/>
+        <w:spacing w:before="0" w:after="160"/>
+        <w:rPr>
+          <w:rFonts w:ascii="Calibri" w:hAnsi="Calibri" w:eastAsia="Calibri" w:cs="Times New Roman"/>
+          <w:sz w:val="24"/>
+          <w:szCs w:val="24"/>
+        </w:rPr>
+      </w:pPr>
+      <w:r>
+        <w:rPr>
+          <w:rFonts w:eastAsia="Calibri" w:cs="Times New Roman" w:ascii="Calibri" w:hAnsi="Calibri"/>
           <w:sz w:val="24"/>
           <w:szCs w:val="24"/>
         </w:rPr>
@@ -6148,7 +6059,6 @@
     <w:rsid w:val="00183b9c"/>
     <w:pPr>
       <w:widowControl/>
-      <w:suppressAutoHyphens w:val="true"/>
       <w:bidi w:val="0"/>
       <w:spacing w:lineRule="auto" w:line="259" w:before="0" w:after="160"/>
       <w:jc w:val="start"/>
@@ -6320,42 +6230,6 @@
     </w:pPr>
     <w:rPr>
       <w:rFonts w:ascii="Times New Roman" w:hAnsi="Times New Roman" w:eastAsia="Times New Roman" w:cs="Times New Roman"/>
-    </w:rPr>
-  </w:style>
-  <w:style w:type="paragraph" w:styleId="PreformattedText">
-    <w:name w:val="Preformatted Text"/>
-    <w:basedOn w:val="Normal"/>
-    <w:qFormat/>
-    <w:pPr>
-      <w:spacing w:before="0" w:after="0"/>
-    </w:pPr>
-    <w:rPr>
-      <w:rFonts w:ascii="Liberation Mono" w:hAnsi="Liberation Mono" w:eastAsia="Liberation Mono" w:cs="Liberation Mono"/>
-      <w:sz w:val="20"/>
-      <w:szCs w:val="20"/>
-    </w:rPr>
-  </w:style>
-  <w:style w:type="paragraph" w:styleId="TableContents">
-    <w:name w:val="Table Contents"/>
-    <w:basedOn w:val="Normal"/>
-    <w:qFormat/>
-    <w:pPr>
-      <w:widowControl w:val="false"/>
-      <w:suppressLineNumbers/>
-    </w:pPr>
-    <w:rPr/>
-  </w:style>
-  <w:style w:type="paragraph" w:styleId="TableHeading">
-    <w:name w:val="Table Heading"/>
-    <w:basedOn w:val="TableContents"/>
-    <w:qFormat/>
-    <w:pPr>
-      <w:suppressLineNumbers/>
-      <w:jc w:val="center"/>
-    </w:pPr>
-    <w:rPr>
-      <w:b/>
-      <w:bCs/>
     </w:rPr>
   </w:style>
   <w:style w:type="numbering" w:styleId="NoList" w:default="1">
@@ -6578,7 +6452,7 @@
 </file>
 
 <file path=customXml/itemProps1.xml><?xml version="1.0" encoding="utf-8"?>
-<ds:datastoreItem xmlns:ds="http://schemas.openxmlformats.org/officeDocument/2006/customXml" ds:itemID="{5CAD4B83-0C66-497A-AF67-5208F156458E}">
+<ds:datastoreItem xmlns:ds="http://schemas.openxmlformats.org/officeDocument/2006/customXml" ds:itemID="{D37DE17C-91A4-4C92-9F49-9D3B579FFC2B}">
   <ds:schemaRefs>
     <ds:schemaRef ds:uri="http://schemas.openxmlformats.org/officeDocument/2006/bibliography"/>
   </ds:schemaRefs>

</xml_diff>